<commit_message>
paper: SafeNN V2 — full accuracy verification for all 6 cases. Sec 3.4.1-3.4.6 each with dedicated figure: Kolmogorov sin-profile vs analytical, Channel Poiseuille parabola, Couette linear, Cavity Re=100 vs Ghia 1982, multi-cyl voxel contour, Cavity Re=400 vs Ghia 1982. 3.5 summary table.
</commit_message>
<xml_diff>
--- a/solver_LBM_steady_state/SafeNN_LBM_Paper_V2_KR.docx
+++ b/solver_LBM_steady_state/SafeNN_LBM_Paper_V2_KR.docx
@@ -2,7 +2,7 @@
 <file path=word/document.xml><?xml version="1.0" encoding="utf-8"?>
 <w:document xmlns:w="http://schemas.openxmlformats.org/wordprocessingml/2006/main" xmlns:m="http://schemas.openxmlformats.org/officeDocument/2006/math" xmlns:r="http://schemas.openxmlformats.org/officeDocument/2006/relationships" xmlns:o="urn:schemas-microsoft-com:office:office" xmlns:v="urn:schemas-microsoft-com:vml" xmlns:w10="urn:schemas-microsoft-com:office:word" xmlns:a="http://schemas.openxmlformats.org/drawingml/2006/main" xmlns:pic="http://schemas.openxmlformats.org/drawingml/2006/picture" xmlns:wp="http://schemas.openxmlformats.org/drawingml/2006/wordprocessingDrawing">
   <w:body>
-    <w:bookmarkStart w:id="75" w:name="Xafabf03f61dac42efdd30ea453690a3d824758e"/>
+    <w:bookmarkStart w:id="92" w:name="Xafabf03f61dac42efdd30ea453690a3d824758e"/>
     <w:p>
       <w:pPr>
         <w:pStyle w:val="Heading1"/>
@@ -14033,7 +14033,7 @@
     </w:p>
     <w:bookmarkEnd w:id="52"/>
     <w:bookmarkEnd w:id="53"/>
-    <w:bookmarkStart w:id="72" w:name="결과-results"/>
+    <w:bookmarkStart w:id="89" w:name="결과-results"/>
     <w:p>
       <w:pPr>
         <w:pStyle w:val="Heading2"/>
@@ -15211,13 +15211,30 @@
       </w:r>
     </w:p>
     <w:bookmarkEnd w:id="62"/>
-    <w:bookmarkStart w:id="66" w:name="정확도-검증-field-profile"/>
+    <w:bookmarkStart w:id="87" w:name="정확도-검증-모든-사례"/>
     <w:p>
       <w:pPr>
         <w:pStyle w:val="Heading3"/>
       </w:pPr>
       <w:r>
-        <w:t xml:space="preserve">3.4 정확도 검증 (Field profile)</w:t>
+        <w:t xml:space="preserve">3.4 정확도 검증 — 모든 사례</w:t>
+      </w:r>
+    </w:p>
+    <w:p>
+      <w:pPr>
+        <w:pStyle w:val="FirstParagraph"/>
+      </w:pPr>
+      <w:r>
+        <w:t xml:space="preserve">본 절은 6개 검증 사례 각각에 대해 Safe-NN 의 정상해가 baseline LBM 또는 해석해와 일치함을 확인한다.</w:t>
+      </w:r>
+    </w:p>
+    <w:bookmarkStart w:id="66" w:name="case-1.-kolmogorov-흐름-해석해-비교"/>
+    <w:p>
+      <w:pPr>
+        <w:pStyle w:val="Heading4"/>
+      </w:pPr>
+      <w:r>
+        <w:t xml:space="preserve">3.4.1 Case 1. Kolmogorov 흐름 (해석해 비교)</w:t>
       </w:r>
     </w:p>
     <w:p>
@@ -15227,14 +15244,14 @@
       <w:r>
         <w:drawing>
           <wp:inline>
-            <wp:extent cx="5334000" cy="2024785"/>
+            <wp:extent cx="5334000" cy="3783343"/>
             <wp:effectExtent b="0" l="0" r="0" t="0"/>
-            <wp:docPr descr="Fig 3. Field profile validation: Baseline vs Safe-NN" title="" id="64" name="Picture"/>
+            <wp:docPr descr="Fig 3. Kolmogorov u-profile vs analytical" title="" id="64" name="Picture"/>
             <a:graphic>
               <a:graphicData uri="http://schemas.openxmlformats.org/drawingml/2006/picture">
                 <pic:pic>
                   <pic:nvPicPr>
-                    <pic:cNvPr descr="figs/v2_fig3_field_profiles.png" id="65" name="Picture"/>
+                    <pic:cNvPr descr="figs/v3_acc1_kolmogorov.png" id="65" name="Picture"/>
                     <pic:cNvPicPr>
                       <a:picLocks noChangeArrowheads="1" noChangeAspect="1"/>
                     </pic:cNvPicPr>
@@ -15248,7 +15265,7 @@
                   <pic:spPr bwMode="auto">
                     <a:xfrm>
                       <a:off x="0" y="0"/>
-                      <a:ext cx="5334000" cy="2024785"/>
+                      <a:ext cx="5334000" cy="3783343"/>
                     </a:xfrm>
                     <a:prstGeom prst="rect">
                       <a:avLst/>
@@ -15272,7 +15289,7 @@
         <w:pStyle w:val="ImageCaption"/>
       </w:pPr>
       <w:r>
-        <w:t xml:space="preserve">Fig 3. Field profile validation: Baseline vs Safe-NN</w:t>
+        <w:t xml:space="preserve">Fig 3. Kolmogorov u-profile vs analytical</w:t>
       </w:r>
     </w:p>
     <w:p>
@@ -15290,7 +15307,7 @@
         <w:t xml:space="preserve"> </w:t>
       </w:r>
       <w:r>
-        <w:t xml:space="preserve">(왼쪽) Channel u-velocity profile</w:t>
+        <w:t xml:space="preserve">Kolmogorov 흐름 N=32 의 u-velocity profile</w:t>
       </w:r>
       <w:r>
         <w:t xml:space="preserve"> </w:t>
@@ -15314,10 +15331,7 @@
         </m:d>
       </m:oMath>
       <w:r>
-        <w:t xml:space="preserve"> </w:t>
-      </w:r>
-      <w:r>
-        <w:t xml:space="preserve">— Baseline 과 Safe-NN 거의 완전 일치. (오른쪽) Lid-driven cavity Re=100 N=65 의 centerline u-velocity (x=N/2) 정규화</w:t>
+        <w:t xml:space="preserve">. 해석해</w:t>
       </w:r>
       <w:r>
         <w:t xml:space="preserve"> </w:t>
@@ -15326,64 +15340,138 @@
         <m:r>
           <m:t>u</m:t>
         </m:r>
+        <m:d>
+          <m:dPr>
+            <m:begChr m:val="("/>
+            <m:endChr m:val=")"/>
+            <m:sepChr m:val=""/>
+            <m:grow/>
+          </m:dPr>
+          <m:e>
+            <m:r>
+              <m:t>y</m:t>
+            </m:r>
+          </m:e>
+        </m:d>
         <m:r>
           <m:rPr>
             <m:sty m:val="p"/>
           </m:rPr>
-          <m:t>/</m:t>
-        </m:r>
-        <m:sSub>
+          <m:t>=</m:t>
+        </m:r>
+        <m:d>
+          <m:dPr>
+            <m:begChr m:val="("/>
+            <m:endChr m:val=")"/>
+            <m:sepChr m:val=""/>
+            <m:grow/>
+          </m:dPr>
           <m:e>
-            <m:r>
-              <m:t>U</m:t>
-            </m:r>
-          </m:e>
-          <m:sub>
+            <m:sSub>
+              <m:e>
+                <m:r>
+                  <m:t>F</m:t>
+                </m:r>
+              </m:e>
+              <m:sub>
+                <m:r>
+                  <m:t>0</m:t>
+                </m:r>
+              </m:sub>
+            </m:sSub>
             <m:r>
               <m:rPr>
-                <m:nor/>
                 <m:sty m:val="p"/>
               </m:rPr>
-              <m:t>wall</m:t>
-            </m:r>
-          </m:sub>
-        </m:sSub>
-      </m:oMath>
-      <w:r>
-        <w:t xml:space="preserve"> </w:t>
-      </w:r>
-      <w:r>
-        <w:t xml:space="preserve">vs</w:t>
-      </w:r>
-      <w:r>
-        <w:t xml:space="preserve"> </w:t>
-      </w:r>
-      <m:oMath>
-        <m:r>
-          <m:t>y</m:t>
-        </m:r>
+              <m:t>/</m:t>
+            </m:r>
+            <m:r>
+              <m:t>ν</m:t>
+            </m:r>
+            <m:sSup>
+              <m:e>
+                <m:r>
+                  <m:t>k</m:t>
+                </m:r>
+              </m:e>
+              <m:sup>
+                <m:r>
+                  <m:t>2</m:t>
+                </m:r>
+              </m:sup>
+            </m:sSup>
+          </m:e>
+        </m:d>
         <m:r>
           <m:rPr>
             <m:sty m:val="p"/>
           </m:rPr>
-          <m:t>/</m:t>
-        </m:r>
-        <m:r>
-          <m:t>L</m:t>
-        </m:r>
+          <m:t>sin</m:t>
+        </m:r>
+        <m:d>
+          <m:dPr>
+            <m:begChr m:val="("/>
+            <m:endChr m:val=")"/>
+            <m:sepChr m:val=""/>
+            <m:grow/>
+          </m:dPr>
+          <m:e>
+            <m:r>
+              <m:t>k</m:t>
+            </m:r>
+            <m:r>
+              <m:t>y</m:t>
+            </m:r>
+          </m:e>
+        </m:d>
       </m:oMath>
       <w:r>
-        <w:t xml:space="preserve">. Safe-NN 의 정상해가 baseline 과 정확히 일치한다.</w:t>
+        <w:t xml:space="preserve"> </w:t>
+      </w:r>
+      <w:r>
+        <w:t xml:space="preserve">(검은 실선) 과 baseline LBM (회색 원), Safe-NN (빨강 사각형) 비교. 두 방법 모두 해석해와 거의 완전히 일치 (RMS error</w:t>
+      </w:r>
+      <w:r>
+        <w:t xml:space="preserve"> </w:t>
+      </w:r>
+      <m:oMath>
+        <m:r>
+          <m:rPr>
+            <m:sty m:val="p"/>
+          </m:rPr>
+          <m:t>∼</m:t>
+        </m:r>
+        <m:sSup>
+          <m:e>
+            <m:r>
+              <m:t>10</m:t>
+            </m:r>
+          </m:e>
+          <m:sup>
+            <m:r>
+              <m:rPr>
+                <m:sty m:val="p"/>
+              </m:rPr>
+              <m:t>−</m:t>
+            </m:r>
+            <m:r>
+              <m:t>5</m:t>
+            </m:r>
+          </m:sup>
+        </m:sSup>
+      </m:oMath>
+      <w:r>
+        <w:t xml:space="preserve">). Safe-NN 의 RMS 가 baseline 과 동등 수준.</w:t>
       </w:r>
     </w:p>
     <w:bookmarkEnd w:id="66"/>
-    <w:bookmarkStart w:id="70" w:name="cavity-re100-contour-비교"/>
-    <w:p>
-      <w:pPr>
-        <w:pStyle w:val="Heading3"/>
-      </w:pPr>
-      <w:r>
-        <w:t xml:space="preserve">3.5 Cavity Re=100 contour 비교</w:t>
+    <w:bookmarkStart w:id="70" w:name="case-2.-channel-poiseuille-흐름-해석해-비교"/>
+    <w:p>
+      <w:pPr>
+        <w:pStyle w:val="Heading4"/>
+      </w:pPr>
+      <w:r>
+        <w:t xml:space="preserve">3.4.2 Case 2. Channel (Poiseuille) 흐름 (해석해 비교)</w:t>
       </w:r>
     </w:p>
     <w:p>
@@ -15393,14 +15481,14 @@
       <w:r>
         <w:drawing>
           <wp:inline>
-            <wp:extent cx="5334000" cy="1633406"/>
+            <wp:extent cx="5334000" cy="3783343"/>
             <wp:effectExtent b="0" l="0" r="0" t="0"/>
-            <wp:docPr descr="Fig 4. Cavity Re=100 contour: Baseline vs Safe-NN" title="" id="68" name="Picture"/>
+            <wp:docPr descr="Fig 4. Channel u-profile vs Poiseuille" title="" id="68" name="Picture"/>
             <a:graphic>
               <a:graphicData uri="http://schemas.openxmlformats.org/drawingml/2006/picture">
                 <pic:pic>
                   <pic:nvPicPr>
-                    <pic:cNvPr descr="figs/v2_fig4_cavity_contour.png" id="69" name="Picture"/>
+                    <pic:cNvPr descr="figs/v3_acc2_channel.png" id="69" name="Picture"/>
                     <pic:cNvPicPr>
                       <a:picLocks noChangeArrowheads="1" noChangeAspect="1"/>
                     </pic:cNvPicPr>
@@ -15414,7 +15502,7 @@
                   <pic:spPr bwMode="auto">
                     <a:xfrm>
                       <a:off x="0" y="0"/>
-                      <a:ext cx="5334000" cy="1633406"/>
+                      <a:ext cx="5334000" cy="3783343"/>
                     </a:xfrm>
                     <a:prstGeom prst="rect">
                       <a:avLst/>
@@ -15438,7 +15526,7 @@
         <w:pStyle w:val="ImageCaption"/>
       </w:pPr>
       <w:r>
-        <w:t xml:space="preserve">Fig 4. Cavity Re=100 contour: Baseline vs Safe-NN</w:t>
+        <w:t xml:space="preserve">Fig 4. Channel u-profile vs Poiseuille</w:t>
       </w:r>
     </w:p>
     <w:p>
@@ -15456,220 +15544,14 @@
         <w:t xml:space="preserve"> </w:t>
       </w:r>
       <w:r>
-        <w:t xml:space="preserve">Lid-driven cavity Re=100 N=65 의 속도 크기</w:t>
+        <w:t xml:space="preserve">Channel flow N=32 의 u-velocity profile</w:t>
       </w:r>
       <w:r>
         <w:t xml:space="preserve"> </w:t>
       </w:r>
       <m:oMath>
         <m:r>
-          <m:rPr>
-            <m:sty m:val="p"/>
-          </m:rPr>
-          <m:t>∥</m:t>
-        </m:r>
-        <m:r>
-          <m:rPr>
-            <m:sty m:val="b"/>
-          </m:rPr>
           <m:t>u</m:t>
-        </m:r>
-        <m:r>
-          <m:rPr>
-            <m:sty m:val="p"/>
-          </m:rPr>
-          <m:t>∥</m:t>
-        </m:r>
-      </m:oMath>
-      <w:r>
-        <w:t xml:space="preserve"> </w:t>
-      </w:r>
-      <w:r>
-        <w:t xml:space="preserve">contour. (왼쪽) Baseline LBM, (가운데) Safe-NN, (오른쪽) 두 결과의 절대 차이. 최대 차이</w:t>
-      </w:r>
-      <w:r>
-        <w:t xml:space="preserve"> </w:t>
-      </w:r>
-      <m:oMath>
-        <m:r>
-          <m:rPr>
-            <m:sty m:val="p"/>
-          </m:rPr>
-          <m:t>∼</m:t>
-        </m:r>
-        <m:sSup>
-          <m:e>
-            <m:r>
-              <m:t>10</m:t>
-            </m:r>
-          </m:e>
-          <m:sup>
-            <m:r>
-              <m:rPr>
-                <m:sty m:val="p"/>
-              </m:rPr>
-              <m:t>−</m:t>
-            </m:r>
-            <m:r>
-              <m:t>5</m:t>
-            </m:r>
-          </m:sup>
-        </m:sSup>
-      </m:oMath>
-      <w:r>
-        <w:t xml:space="preserve"> </w:t>
-      </w:r>
-      <w:r>
-        <w:t xml:space="preserve">수준으로, 시각적으로 구별 불가. Safe-NN 의 정상해 정확도가 baseline 과 완전히 동등함을 확인한다.</w:t>
-      </w:r>
-    </w:p>
-    <w:bookmarkEnd w:id="70"/>
-    <w:bookmarkStart w:id="71" w:name="stress-test-cavity-re400-n49"/>
-    <w:p>
-      <w:pPr>
-        <w:pStyle w:val="Heading3"/>
-      </w:pPr>
-      <w:r>
-        <w:t xml:space="preserve">3.6 stress test: Cavity Re=400 N=49</w:t>
-      </w:r>
-    </w:p>
-    <w:p>
-      <w:pPr>
-        <w:pStyle w:val="FirstParagraph"/>
-      </w:pPr>
-      <w:r>
-        <w:t xml:space="preserve">stiff regime 인 cavity Re=400 N=49 에서 baseline 8,040 LBE 로 수렴, Safe-NN 1,421 LBE 로 수렴 (5.66 배 가속). 수렴 잔차</w:t>
-      </w:r>
-      <w:r>
-        <w:t xml:space="preserve"> </w:t>
-      </w:r>
-      <m:oMath>
-        <m:r>
-          <m:t>4.77</m:t>
-        </m:r>
-        <m:r>
-          <m:rPr>
-            <m:sty m:val="p"/>
-          </m:rPr>
-          <m:t>×</m:t>
-        </m:r>
-        <m:sSup>
-          <m:e>
-            <m:r>
-              <m:t>10</m:t>
-            </m:r>
-          </m:e>
-          <m:sup>
-            <m:r>
-              <m:rPr>
-                <m:sty m:val="p"/>
-              </m:rPr>
-              <m:t>−</m:t>
-            </m:r>
-            <m:r>
-              <m:t>7</m:t>
-            </m:r>
-          </m:sup>
-        </m:sSup>
-      </m:oMath>
-      <w:r>
-        <w:t xml:space="preserve"> </w:t>
-      </w:r>
-      <w:r>
-        <w:t xml:space="preserve">로 tolerance 도달. 본 사례는 BGK 완화율</w:t>
-      </w:r>
-      <w:r>
-        <w:t xml:space="preserve"> </w:t>
-      </w:r>
-      <m:oMath>
-        <m:r>
-          <m:t>ω</m:t>
-        </m:r>
-        <m:r>
-          <m:rPr>
-            <m:sty m:val="p"/>
-          </m:rPr>
-          <m:t>≈</m:t>
-        </m:r>
-        <m:r>
-          <m:t>1.94</m:t>
-        </m:r>
-      </m:oMath>
-      <w:r>
-        <w:t xml:space="preserve"> </w:t>
-      </w:r>
-      <w:r>
-        <w:t xml:space="preserve">로 발산 위험이 큰 영역이나, Safe-NN 의 잔차 단조 안전성 검사가 발산을 완전히 차단하였다.</w:t>
-      </w:r>
-    </w:p>
-    <w:p>
-      <w:r>
-        <w:pict>
-          <v:rect style="width:0;height:1.5pt" o:hralign="center" o:hrstd="t" o:hr="t"/>
-        </w:pict>
-      </w:r>
-    </w:p>
-    <w:bookmarkEnd w:id="71"/>
-    <w:bookmarkEnd w:id="72"/>
-    <w:bookmarkStart w:id="73" w:name="결론-conclusions"/>
-    <w:p>
-      <w:pPr>
-        <w:pStyle w:val="Heading2"/>
-      </w:pPr>
-      <w:r>
-        <w:t xml:space="preserve">4. 결론 (Conclusions)</w:t>
-      </w:r>
-    </w:p>
-    <w:p>
-      <w:pPr>
-        <w:pStyle w:val="FirstParagraph"/>
-      </w:pPr>
-      <w:r>
-        <w:t xml:space="preserve">본 연구는 격자 볼츠만 방법의 정상상태 해를 가속하는 단일 알고리즘</w:t>
-      </w:r>
-      <w:r>
-        <w:t xml:space="preserve"> </w:t>
-      </w:r>
-      <w:r>
-        <w:rPr>
-          <w:b/>
-          <w:bCs/>
-        </w:rPr>
-        <w:t xml:space="preserve">Safe-NN-SCMK</w:t>
-      </w:r>
-      <w:r>
-        <w:t xml:space="preserve"> </w:t>
-      </w:r>
-      <w:r>
-        <w:t xml:space="preserve">를 제안하였다. 본 방법의 핵심 기여는 다음과 같다.</w:t>
-      </w:r>
-    </w:p>
-    <w:p>
-      <w:pPr>
-        <w:numPr>
-          <w:ilvl w:val="0"/>
-          <w:numId w:val="1004"/>
-        </w:numPr>
-      </w:pPr>
-      <w:r>
-        <w:rPr>
-          <w:b/>
-          <w:bCs/>
-        </w:rPr>
-        <w:t xml:space="preserve">표준 LBM 의 collision, streaming, 외력, 경계 연산자를 일절 수정하지 않고</w:t>
-      </w:r>
-      <w:r>
-        <w:t xml:space="preserve"> </w:t>
-      </w:r>
-      <w:r>
-        <w:t xml:space="preserve">native residual</w:t>
-      </w:r>
-      <w:r>
-        <w:t xml:space="preserve"> </w:t>
-      </w:r>
-      <m:oMath>
-        <m:r>
-          <m:t>R</m:t>
         </m:r>
         <m:d>
           <m:dPr>
@@ -15680,31 +15562,20 @@
           </m:dPr>
           <m:e>
             <m:r>
-              <m:t>f</m:t>
+              <m:t>y</m:t>
             </m:r>
           </m:e>
         </m:d>
-        <m:r>
-          <m:rPr>
-            <m:sty m:val="p"/>
-          </m:rPr>
-          <m:t>=</m:t>
-        </m:r>
-        <m:r>
-          <m:t>f</m:t>
-        </m:r>
-        <m:r>
-          <m:rPr>
-            <m:sty m:val="p"/>
-          </m:rPr>
-          <m:t>−</m:t>
-        </m:r>
-        <m:r>
-          <m:rPr>
-            <m:sty m:val="p"/>
-            <m:scr m:val="script"/>
-          </m:rPr>
-          <m:t>L</m:t>
+      </m:oMath>
+      <w:r>
+        <w:t xml:space="preserve">. 해석해 (Poiseuille 포물선)</w:t>
+      </w:r>
+      <w:r>
+        <w:t xml:space="preserve"> </w:t>
+      </w:r>
+      <m:oMath>
+        <m:r>
+          <m:t>u</m:t>
         </m:r>
         <m:d>
           <m:dPr>
@@ -15715,7 +15586,7 @@
           </m:dPr>
           <m:e>
             <m:r>
-              <m:t>f</m:t>
+              <m:t>y</m:t>
             </m:r>
           </m:e>
         </m:d>
@@ -15726,14 +15597,1452 @@
           <m:t>=</m:t>
         </m:r>
         <m:r>
-          <m:t>0</m:t>
-        </m:r>
+          <m:t>4</m:t>
+        </m:r>
+        <m:sSub>
+          <m:e>
+            <m:r>
+              <m:t>u</m:t>
+            </m:r>
+          </m:e>
+          <m:sub>
+            <m:r>
+              <m:rPr>
+                <m:sty m:val="p"/>
+              </m:rPr>
+              <m:t>max</m:t>
+            </m:r>
+          </m:sub>
+        </m:sSub>
+        <m:d>
+          <m:dPr>
+            <m:begChr m:val="("/>
+            <m:endChr m:val=")"/>
+            <m:sepChr m:val=""/>
+            <m:grow/>
+          </m:dPr>
+          <m:e>
+            <m:r>
+              <m:t>y</m:t>
+            </m:r>
+            <m:r>
+              <m:rPr>
+                <m:sty m:val="p"/>
+              </m:rPr>
+              <m:t>/</m:t>
+            </m:r>
+            <m:r>
+              <m:t>L</m:t>
+            </m:r>
+          </m:e>
+        </m:d>
+        <m:d>
+          <m:dPr>
+            <m:begChr m:val="("/>
+            <m:endChr m:val=")"/>
+            <m:sepChr m:val=""/>
+            <m:grow/>
+          </m:dPr>
+          <m:e>
+            <m:r>
+              <m:t>1</m:t>
+            </m:r>
+            <m:r>
+              <m:rPr>
+                <m:sty m:val="p"/>
+              </m:rPr>
+              <m:t>−</m:t>
+            </m:r>
+            <m:r>
+              <m:t>y</m:t>
+            </m:r>
+            <m:r>
+              <m:rPr>
+                <m:sty m:val="p"/>
+              </m:rPr>
+              <m:t>/</m:t>
+            </m:r>
+            <m:r>
+              <m:t>L</m:t>
+            </m:r>
+          </m:e>
+        </m:d>
       </m:oMath>
       <w:r>
-        <w:t xml:space="preserve"> </w:t>
-      </w:r>
-      <w:r>
-        <w:t xml:space="preserve">을 그대로 보존한다.</w:t>
+        <w:t xml:space="preserve">,</w:t>
+      </w:r>
+      <w:r>
+        <w:t xml:space="preserve"> </w:t>
+      </w:r>
+      <m:oMath>
+        <m:sSub>
+          <m:e>
+            <m:r>
+              <m:t>u</m:t>
+            </m:r>
+          </m:e>
+          <m:sub>
+            <m:r>
+              <m:rPr>
+                <m:sty m:val="p"/>
+              </m:rPr>
+              <m:t>max</m:t>
+            </m:r>
+          </m:sub>
+        </m:sSub>
+        <m:r>
+          <m:rPr>
+            <m:sty m:val="p"/>
+          </m:rPr>
+          <m:t>=</m:t>
+        </m:r>
+        <m:sSub>
+          <m:e>
+            <m:r>
+              <m:t>F</m:t>
+            </m:r>
+          </m:e>
+          <m:sub>
+            <m:r>
+              <m:t>0</m:t>
+            </m:r>
+          </m:sub>
+        </m:sSub>
+        <m:sSup>
+          <m:e>
+            <m:r>
+              <m:t>L</m:t>
+            </m:r>
+          </m:e>
+          <m:sup>
+            <m:r>
+              <m:t>2</m:t>
+            </m:r>
+          </m:sup>
+        </m:sSup>
+        <m:r>
+          <m:rPr>
+            <m:sty m:val="p"/>
+          </m:rPr>
+          <m:t>/</m:t>
+        </m:r>
+        <m:d>
+          <m:dPr>
+            <m:begChr m:val="("/>
+            <m:endChr m:val=")"/>
+            <m:sepChr m:val=""/>
+            <m:grow/>
+          </m:dPr>
+          <m:e>
+            <m:r>
+              <m:t>8</m:t>
+            </m:r>
+            <m:r>
+              <m:t>ν</m:t>
+            </m:r>
+          </m:e>
+        </m:d>
+      </m:oMath>
+      <w:r>
+        <w:t xml:space="preserve"> </w:t>
+      </w:r>
+      <w:r>
+        <w:t xml:space="preserve">(검은 실선) 과 baseline / Safe-NN 비교. Safe-NN 정상해가 해석해와 baseline 모두와 일치하며, RMS error 차이는</w:t>
+      </w:r>
+      <w:r>
+        <w:t xml:space="preserve"> </w:t>
+      </w:r>
+      <m:oMath>
+        <m:sSup>
+          <m:e>
+            <m:r>
+              <m:t>10</m:t>
+            </m:r>
+          </m:e>
+          <m:sup>
+            <m:r>
+              <m:rPr>
+                <m:sty m:val="p"/>
+              </m:rPr>
+              <m:t>−</m:t>
+            </m:r>
+            <m:r>
+              <m:t>6</m:t>
+            </m:r>
+          </m:sup>
+        </m:sSup>
+      </m:oMath>
+      <w:r>
+        <w:t xml:space="preserve"> </w:t>
+      </w:r>
+      <w:r>
+        <w:t xml:space="preserve">수준이다.</w:t>
+      </w:r>
+    </w:p>
+    <w:bookmarkEnd w:id="70"/>
+    <w:bookmarkStart w:id="74" w:name="case-3.-couette-흐름-해석해-비교"/>
+    <w:p>
+      <w:pPr>
+        <w:pStyle w:val="Heading4"/>
+      </w:pPr>
+      <w:r>
+        <w:t xml:space="preserve">3.4.3 Case 3. Couette 흐름 (해석해 비교)</w:t>
+      </w:r>
+    </w:p>
+    <w:p>
+      <w:pPr>
+        <w:pStyle w:val="CaptionedFigure"/>
+      </w:pPr>
+      <w:r>
+        <w:drawing>
+          <wp:inline>
+            <wp:extent cx="5334000" cy="3783343"/>
+            <wp:effectExtent b="0" l="0" r="0" t="0"/>
+            <wp:docPr descr="Fig 5. Couette u-profile vs linear" title="" id="72" name="Picture"/>
+            <a:graphic>
+              <a:graphicData uri="http://schemas.openxmlformats.org/drawingml/2006/picture">
+                <pic:pic>
+                  <pic:nvPicPr>
+                    <pic:cNvPr descr="figs/v3_acc3_couette.png" id="73" name="Picture"/>
+                    <pic:cNvPicPr>
+                      <a:picLocks noChangeArrowheads="1" noChangeAspect="1"/>
+                    </pic:cNvPicPr>
+                  </pic:nvPicPr>
+                  <pic:blipFill>
+                    <a:blip r:embed="rId71"/>
+                    <a:stretch>
+                      <a:fillRect/>
+                    </a:stretch>
+                  </pic:blipFill>
+                  <pic:spPr bwMode="auto">
+                    <a:xfrm>
+                      <a:off x="0" y="0"/>
+                      <a:ext cx="5334000" cy="3783343"/>
+                    </a:xfrm>
+                    <a:prstGeom prst="rect">
+                      <a:avLst/>
+                    </a:prstGeom>
+                    <a:noFill/>
+                    <a:ln w="9525">
+                      <a:noFill/>
+                      <a:headEnd/>
+                      <a:tailEnd/>
+                    </a:ln>
+                  </pic:spPr>
+                </pic:pic>
+              </a:graphicData>
+            </a:graphic>
+          </wp:inline>
+        </w:drawing>
+      </w:r>
+    </w:p>
+    <w:p>
+      <w:pPr>
+        <w:pStyle w:val="ImageCaption"/>
+      </w:pPr>
+      <w:r>
+        <w:t xml:space="preserve">Fig 5. Couette u-profile vs linear</w:t>
+      </w:r>
+    </w:p>
+    <w:p>
+      <w:pPr>
+        <w:pStyle w:val="BodyText"/>
+      </w:pPr>
+      <w:r>
+        <w:rPr>
+          <w:b/>
+          <w:bCs/>
+        </w:rPr>
+        <w:t xml:space="preserve">그림 5.</w:t>
+      </w:r>
+      <w:r>
+        <w:t xml:space="preserve"> </w:t>
+      </w:r>
+      <w:r>
+        <w:t xml:space="preserve">Couette flow N=32 의 u-velocity profile</w:t>
+      </w:r>
+      <w:r>
+        <w:t xml:space="preserve"> </w:t>
+      </w:r>
+      <m:oMath>
+        <m:r>
+          <m:t>u</m:t>
+        </m:r>
+        <m:d>
+          <m:dPr>
+            <m:begChr m:val="("/>
+            <m:endChr m:val=")"/>
+            <m:sepChr m:val=""/>
+            <m:grow/>
+          </m:dPr>
+          <m:e>
+            <m:r>
+              <m:t>y</m:t>
+            </m:r>
+          </m:e>
+        </m:d>
+      </m:oMath>
+      <w:r>
+        <w:t xml:space="preserve">. 해석해</w:t>
+      </w:r>
+      <w:r>
+        <w:t xml:space="preserve"> </w:t>
+      </w:r>
+      <m:oMath>
+        <m:r>
+          <m:t>u</m:t>
+        </m:r>
+        <m:d>
+          <m:dPr>
+            <m:begChr m:val="("/>
+            <m:endChr m:val=")"/>
+            <m:sepChr m:val=""/>
+            <m:grow/>
+          </m:dPr>
+          <m:e>
+            <m:r>
+              <m:t>y</m:t>
+            </m:r>
+          </m:e>
+        </m:d>
+        <m:r>
+          <m:rPr>
+            <m:sty m:val="p"/>
+          </m:rPr>
+          <m:t>=</m:t>
+        </m:r>
+        <m:sSub>
+          <m:e>
+            <m:r>
+              <m:t>U</m:t>
+            </m:r>
+          </m:e>
+          <m:sub>
+            <m:r>
+              <m:rPr>
+                <m:nor/>
+                <m:sty m:val="p"/>
+              </m:rPr>
+              <m:t>wall</m:t>
+            </m:r>
+          </m:sub>
+        </m:sSub>
+        <m:r>
+          <m:t>y</m:t>
+        </m:r>
+        <m:r>
+          <m:rPr>
+            <m:sty m:val="p"/>
+          </m:rPr>
+          <m:t>/</m:t>
+        </m:r>
+        <m:r>
+          <m:t>L</m:t>
+        </m:r>
+      </m:oMath>
+      <w:r>
+        <w:t xml:space="preserve"> </w:t>
+      </w:r>
+      <w:r>
+        <w:t xml:space="preserve">(검은 실선) 과 baseline / Safe-NN 비교. Safe-NN 의 선형 profile 이 해석해와 완전히 일치. Couette 는 정상해가 선형이라 빠른 수렴 (Safe-NN 30 LBE) 이 가능하며, 해석해 RMS error 도 baseline 과 동일하다.</w:t>
+      </w:r>
+    </w:p>
+    <w:bookmarkEnd w:id="74"/>
+    <w:bookmarkStart w:id="78" w:name="X16172d37854333b36d065d88429613d8a4a0aca"/>
+    <w:p>
+      <w:pPr>
+        <w:pStyle w:val="Heading4"/>
+      </w:pPr>
+      <w:r>
+        <w:t xml:space="preserve">3.4.4 Case 4. Lid-driven cavity Re=100 (Ghia 1982 비교)</w:t>
+      </w:r>
+    </w:p>
+    <w:p>
+      <w:pPr>
+        <w:pStyle w:val="CaptionedFigure"/>
+      </w:pPr>
+      <w:r>
+        <w:drawing>
+          <wp:inline>
+            <wp:extent cx="5334000" cy="2032658"/>
+            <wp:effectExtent b="0" l="0" r="0" t="0"/>
+            <wp:docPr descr="Fig 6. Cavity Re=100 centerline + contour diff" title="" id="76" name="Picture"/>
+            <a:graphic>
+              <a:graphicData uri="http://schemas.openxmlformats.org/drawingml/2006/picture">
+                <pic:pic>
+                  <pic:nvPicPr>
+                    <pic:cNvPr descr="figs/v3_acc4_cavity_re100.png" id="77" name="Picture"/>
+                    <pic:cNvPicPr>
+                      <a:picLocks noChangeArrowheads="1" noChangeAspect="1"/>
+                    </pic:cNvPicPr>
+                  </pic:nvPicPr>
+                  <pic:blipFill>
+                    <a:blip r:embed="rId75"/>
+                    <a:stretch>
+                      <a:fillRect/>
+                    </a:stretch>
+                  </pic:blipFill>
+                  <pic:spPr bwMode="auto">
+                    <a:xfrm>
+                      <a:off x="0" y="0"/>
+                      <a:ext cx="5334000" cy="2032658"/>
+                    </a:xfrm>
+                    <a:prstGeom prst="rect">
+                      <a:avLst/>
+                    </a:prstGeom>
+                    <a:noFill/>
+                    <a:ln w="9525">
+                      <a:noFill/>
+                      <a:headEnd/>
+                      <a:tailEnd/>
+                    </a:ln>
+                  </pic:spPr>
+                </pic:pic>
+              </a:graphicData>
+            </a:graphic>
+          </wp:inline>
+        </w:drawing>
+      </w:r>
+    </w:p>
+    <w:p>
+      <w:pPr>
+        <w:pStyle w:val="ImageCaption"/>
+      </w:pPr>
+      <w:r>
+        <w:t xml:space="preserve">Fig 6. Cavity Re=100 centerline + contour diff</w:t>
+      </w:r>
+    </w:p>
+    <w:p>
+      <w:pPr>
+        <w:pStyle w:val="BodyText"/>
+      </w:pPr>
+      <w:r>
+        <w:rPr>
+          <w:b/>
+          <w:bCs/>
+        </w:rPr>
+        <w:t xml:space="preserve">그림 6.</w:t>
+      </w:r>
+      <w:r>
+        <w:t xml:space="preserve"> </w:t>
+      </w:r>
+      <w:r>
+        <w:t xml:space="preserve">Lid-driven cavity Re=100 N=65 검증. (왼쪽) Vertical centerline (</w:t>
+      </w:r>
+      <m:oMath>
+        <m:r>
+          <m:t>x</m:t>
+        </m:r>
+        <m:r>
+          <m:rPr>
+            <m:sty m:val="p"/>
+          </m:rPr>
+          <m:t>=</m:t>
+        </m:r>
+        <m:r>
+          <m:t>N</m:t>
+        </m:r>
+        <m:r>
+          <m:rPr>
+            <m:sty m:val="p"/>
+          </m:rPr>
+          <m:t>/</m:t>
+        </m:r>
+        <m:r>
+          <m:t>2</m:t>
+        </m:r>
+      </m:oMath>
+      <w:r>
+        <w:t xml:space="preserve">) 의 u-velocity 정규화</w:t>
+      </w:r>
+      <w:r>
+        <w:t xml:space="preserve"> </w:t>
+      </w:r>
+      <m:oMath>
+        <m:r>
+          <m:t>u</m:t>
+        </m:r>
+        <m:r>
+          <m:rPr>
+            <m:sty m:val="p"/>
+          </m:rPr>
+          <m:t>/</m:t>
+        </m:r>
+        <m:sSub>
+          <m:e>
+            <m:r>
+              <m:t>U</m:t>
+            </m:r>
+          </m:e>
+          <m:sub>
+            <m:r>
+              <m:rPr>
+                <m:nor/>
+                <m:sty m:val="p"/>
+              </m:rPr>
+              <m:t>wall</m:t>
+            </m:r>
+          </m:sub>
+        </m:sSub>
+      </m:oMath>
+      <w:r>
+        <w:t xml:space="preserve"> </w:t>
+      </w:r>
+      <w:r>
+        <w:t xml:space="preserve">vs</w:t>
+      </w:r>
+      <w:r>
+        <w:t xml:space="preserve"> </w:t>
+      </w:r>
+      <m:oMath>
+        <m:r>
+          <m:t>y</m:t>
+        </m:r>
+        <m:r>
+          <m:rPr>
+            <m:sty m:val="p"/>
+          </m:rPr>
+          <m:t>/</m:t>
+        </m:r>
+        <m:r>
+          <m:t>L</m:t>
+        </m:r>
+      </m:oMath>
+      <w:r>
+        <w:t xml:space="preserve">. Baseline LBM (회색 원), Safe-NN (빨강 사각형) 모두 Ghia 1982 [16] 의 정답 데이터 (검은 다이아몬드) 와 일치한다. (오른쪽) Baseline 과 Safe-NN 의 velocity magnitude</w:t>
+      </w:r>
+      <w:r>
+        <w:t xml:space="preserve"> </w:t>
+      </w:r>
+      <m:oMath>
+        <m:r>
+          <m:rPr>
+            <m:sty m:val="p"/>
+          </m:rPr>
+          <m:t>∥</m:t>
+        </m:r>
+        <m:r>
+          <m:rPr>
+            <m:sty m:val="b"/>
+          </m:rPr>
+          <m:t>u</m:t>
+        </m:r>
+        <m:r>
+          <m:rPr>
+            <m:sty m:val="p"/>
+          </m:rPr>
+          <m:t>∥</m:t>
+        </m:r>
+      </m:oMath>
+      <w:r>
+        <w:t xml:space="preserve"> </w:t>
+      </w:r>
+      <w:r>
+        <w:t xml:space="preserve">절대 차이 contour. 최대 차이</w:t>
+      </w:r>
+      <w:r>
+        <w:t xml:space="preserve"> </w:t>
+      </w:r>
+      <m:oMath>
+        <m:r>
+          <m:rPr>
+            <m:sty m:val="p"/>
+          </m:rPr>
+          <m:t>∼</m:t>
+        </m:r>
+        <m:sSup>
+          <m:e>
+            <m:r>
+              <m:t>10</m:t>
+            </m:r>
+          </m:e>
+          <m:sup>
+            <m:r>
+              <m:rPr>
+                <m:sty m:val="p"/>
+              </m:rPr>
+              <m:t>−</m:t>
+            </m:r>
+            <m:r>
+              <m:t>5</m:t>
+            </m:r>
+          </m:sup>
+        </m:sSup>
+      </m:oMath>
+      <w:r>
+        <w:t xml:space="preserve"> </w:t>
+      </w:r>
+      <w:r>
+        <w:t xml:space="preserve">수준으로 시각적으로 구별 불가.</w:t>
+      </w:r>
+    </w:p>
+    <w:bookmarkEnd w:id="78"/>
+    <w:bookmarkStart w:id="82" w:name="case-5.-multi-cylinder-voxel-흐름"/>
+    <w:p>
+      <w:pPr>
+        <w:pStyle w:val="Heading4"/>
+      </w:pPr>
+      <w:r>
+        <w:t xml:space="preserve">3.4.5 Case 5. Multi-cylinder voxel 흐름</w:t>
+      </w:r>
+    </w:p>
+    <w:p>
+      <w:pPr>
+        <w:pStyle w:val="CaptionedFigure"/>
+      </w:pPr>
+      <w:r>
+        <w:drawing>
+          <wp:inline>
+            <wp:extent cx="5334000" cy="1639844"/>
+            <wp:effectExtent b="0" l="0" r="0" t="0"/>
+            <wp:docPr descr="Fig 7. Multi-cylinder velocity contour" title="" id="80" name="Picture"/>
+            <a:graphic>
+              <a:graphicData uri="http://schemas.openxmlformats.org/drawingml/2006/picture">
+                <pic:pic>
+                  <pic:nvPicPr>
+                    <pic:cNvPr descr="figs/v3_acc5_multicyl.png" id="81" name="Picture"/>
+                    <pic:cNvPicPr>
+                      <a:picLocks noChangeArrowheads="1" noChangeAspect="1"/>
+                    </pic:cNvPicPr>
+                  </pic:nvPicPr>
+                  <pic:blipFill>
+                    <a:blip r:embed="rId79"/>
+                    <a:stretch>
+                      <a:fillRect/>
+                    </a:stretch>
+                  </pic:blipFill>
+                  <pic:spPr bwMode="auto">
+                    <a:xfrm>
+                      <a:off x="0" y="0"/>
+                      <a:ext cx="5334000" cy="1639844"/>
+                    </a:xfrm>
+                    <a:prstGeom prst="rect">
+                      <a:avLst/>
+                    </a:prstGeom>
+                    <a:noFill/>
+                    <a:ln w="9525">
+                      <a:noFill/>
+                      <a:headEnd/>
+                      <a:tailEnd/>
+                    </a:ln>
+                  </pic:spPr>
+                </pic:pic>
+              </a:graphicData>
+            </a:graphic>
+          </wp:inline>
+        </w:drawing>
+      </w:r>
+    </w:p>
+    <w:p>
+      <w:pPr>
+        <w:pStyle w:val="ImageCaption"/>
+      </w:pPr>
+      <w:r>
+        <w:t xml:space="preserve">Fig 7. Multi-cylinder velocity contour</w:t>
+      </w:r>
+    </w:p>
+    <w:p>
+      <w:pPr>
+        <w:pStyle w:val="BodyText"/>
+      </w:pPr>
+      <w:r>
+        <w:rPr>
+          <w:b/>
+          <w:bCs/>
+        </w:rPr>
+        <w:t xml:space="preserve">그림 7.</w:t>
+      </w:r>
+      <w:r>
+        <w:t xml:space="preserve"> </w:t>
+      </w:r>
+      <w:r>
+        <w:t xml:space="preserve">Multi-cylinder voxel 흐름 N=32 (랜덤 배치 6 개 원기둥, bounce-back). (왼쪽) Baseline LBM 의 velocity magnitude</w:t>
+      </w:r>
+      <w:r>
+        <w:t xml:space="preserve"> </w:t>
+      </w:r>
+      <m:oMath>
+        <m:r>
+          <m:rPr>
+            <m:sty m:val="p"/>
+          </m:rPr>
+          <m:t>∥</m:t>
+        </m:r>
+        <m:r>
+          <m:rPr>
+            <m:sty m:val="b"/>
+          </m:rPr>
+          <m:t>u</m:t>
+        </m:r>
+        <m:r>
+          <m:rPr>
+            <m:sty m:val="p"/>
+          </m:rPr>
+          <m:t>∥</m:t>
+        </m:r>
+      </m:oMath>
+      <w:r>
+        <w:t xml:space="preserve">, (가운데) Safe-NN</w:t>
+      </w:r>
+      <w:r>
+        <w:t xml:space="preserve"> </w:t>
+      </w:r>
+      <m:oMath>
+        <m:r>
+          <m:rPr>
+            <m:sty m:val="p"/>
+          </m:rPr>
+          <m:t>∥</m:t>
+        </m:r>
+        <m:r>
+          <m:rPr>
+            <m:sty m:val="b"/>
+          </m:rPr>
+          <m:t>u</m:t>
+        </m:r>
+        <m:r>
+          <m:rPr>
+            <m:sty m:val="p"/>
+          </m:rPr>
+          <m:t>∥</m:t>
+        </m:r>
+      </m:oMath>
+      <w:r>
+        <w:t xml:space="preserve">, (오른쪽) 두 결과의 절대 차이. Safe-NN 정상해가 baseline 의 복잡 voxel geometry 흐름 패턴을 정확히 재현하며, 최대 차이는</w:t>
+      </w:r>
+      <w:r>
+        <w:t xml:space="preserve"> </w:t>
+      </w:r>
+      <m:oMath>
+        <m:sSup>
+          <m:e>
+            <m:r>
+              <m:t>10</m:t>
+            </m:r>
+          </m:e>
+          <m:sup>
+            <m:r>
+              <m:rPr>
+                <m:sty m:val="p"/>
+              </m:rPr>
+              <m:t>−</m:t>
+            </m:r>
+            <m:r>
+              <m:t>3</m:t>
+            </m:r>
+          </m:sup>
+        </m:sSup>
+      </m:oMath>
+      <w:r>
+        <w:t xml:space="preserve"> </w:t>
+      </w:r>
+      <w:r>
+        <w:t xml:space="preserve">수준.</w:t>
+      </w:r>
+    </w:p>
+    <w:bookmarkEnd w:id="82"/>
+    <w:bookmarkStart w:id="86" w:name="X890014a86c7c8ab168d227a0529380246c46425"/>
+    <w:p>
+      <w:pPr>
+        <w:pStyle w:val="Heading4"/>
+      </w:pPr>
+      <w:r>
+        <w:t xml:space="preserve">3.4.6 Case 6. Lid-driven cavity Re=400 stress test (Ghia 1982 비교)</w:t>
+      </w:r>
+    </w:p>
+    <w:p>
+      <w:pPr>
+        <w:pStyle w:val="CaptionedFigure"/>
+      </w:pPr>
+      <w:r>
+        <w:drawing>
+          <wp:inline>
+            <wp:extent cx="5334000" cy="2032658"/>
+            <wp:effectExtent b="0" l="0" r="0" t="0"/>
+            <wp:docPr descr="Fig 8. Cavity Re=400 centerline + contour diff" title="" id="84" name="Picture"/>
+            <a:graphic>
+              <a:graphicData uri="http://schemas.openxmlformats.org/drawingml/2006/picture">
+                <pic:pic>
+                  <pic:nvPicPr>
+                    <pic:cNvPr descr="figs/v3_acc6_cavity_re400.png" id="85" name="Picture"/>
+                    <pic:cNvPicPr>
+                      <a:picLocks noChangeArrowheads="1" noChangeAspect="1"/>
+                    </pic:cNvPicPr>
+                  </pic:nvPicPr>
+                  <pic:blipFill>
+                    <a:blip r:embed="rId83"/>
+                    <a:stretch>
+                      <a:fillRect/>
+                    </a:stretch>
+                  </pic:blipFill>
+                  <pic:spPr bwMode="auto">
+                    <a:xfrm>
+                      <a:off x="0" y="0"/>
+                      <a:ext cx="5334000" cy="2032658"/>
+                    </a:xfrm>
+                    <a:prstGeom prst="rect">
+                      <a:avLst/>
+                    </a:prstGeom>
+                    <a:noFill/>
+                    <a:ln w="9525">
+                      <a:noFill/>
+                      <a:headEnd/>
+                      <a:tailEnd/>
+                    </a:ln>
+                  </pic:spPr>
+                </pic:pic>
+              </a:graphicData>
+            </a:graphic>
+          </wp:inline>
+        </w:drawing>
+      </w:r>
+    </w:p>
+    <w:p>
+      <w:pPr>
+        <w:pStyle w:val="ImageCaption"/>
+      </w:pPr>
+      <w:r>
+        <w:t xml:space="preserve">Fig 8. Cavity Re=400 centerline + contour diff</w:t>
+      </w:r>
+    </w:p>
+    <w:p>
+      <w:pPr>
+        <w:pStyle w:val="BodyText"/>
+      </w:pPr>
+      <w:r>
+        <w:rPr>
+          <w:b/>
+          <w:bCs/>
+        </w:rPr>
+        <w:t xml:space="preserve">그림 8.</w:t>
+      </w:r>
+      <w:r>
+        <w:t xml:space="preserve"> </w:t>
+      </w:r>
+      <w:r>
+        <w:t xml:space="preserve">stiff regime cavity Re=400 N=65 검증. (왼쪽) Vertical centerline 의</w:t>
+      </w:r>
+      <w:r>
+        <w:t xml:space="preserve"> </w:t>
+      </w:r>
+      <m:oMath>
+        <m:r>
+          <m:t>u</m:t>
+        </m:r>
+        <m:r>
+          <m:rPr>
+            <m:sty m:val="p"/>
+          </m:rPr>
+          <m:t>/</m:t>
+        </m:r>
+        <m:sSub>
+          <m:e>
+            <m:r>
+              <m:t>U</m:t>
+            </m:r>
+          </m:e>
+          <m:sub>
+            <m:r>
+              <m:rPr>
+                <m:nor/>
+                <m:sty m:val="p"/>
+              </m:rPr>
+              <m:t>wall</m:t>
+            </m:r>
+          </m:sub>
+        </m:sSub>
+      </m:oMath>
+      <w:r>
+        <w:t xml:space="preserve"> </w:t>
+      </w:r>
+      <w:r>
+        <w:t xml:space="preserve">vs</w:t>
+      </w:r>
+      <w:r>
+        <w:t xml:space="preserve"> </w:t>
+      </w:r>
+      <m:oMath>
+        <m:r>
+          <m:t>y</m:t>
+        </m:r>
+        <m:r>
+          <m:rPr>
+            <m:sty m:val="p"/>
+          </m:rPr>
+          <m:t>/</m:t>
+        </m:r>
+        <m:r>
+          <m:t>L</m:t>
+        </m:r>
+      </m:oMath>
+      <w:r>
+        <w:t xml:space="preserve">. Baseline 과 Safe-NN 모두 Ghia 1982 [16] 의 Re=400 데이터와 일치 — Safe-NN 의 안전 가드가 NN 의 NaN 발산을 차단하면서도 정상해 정확도를 유지한다. (오른쪽) Velocity magnitude 절대 차이 contour, 최대</w:t>
+      </w:r>
+      <w:r>
+        <w:t xml:space="preserve"> </w:t>
+      </w:r>
+      <m:oMath>
+        <m:r>
+          <m:rPr>
+            <m:sty m:val="p"/>
+          </m:rPr>
+          <m:t>∼</m:t>
+        </m:r>
+        <m:sSup>
+          <m:e>
+            <m:r>
+              <m:t>10</m:t>
+            </m:r>
+          </m:e>
+          <m:sup>
+            <m:r>
+              <m:rPr>
+                <m:sty m:val="p"/>
+              </m:rPr>
+              <m:t>−</m:t>
+            </m:r>
+            <m:r>
+              <m:t>5</m:t>
+            </m:r>
+          </m:sup>
+        </m:sSup>
+      </m:oMath>
+      <w:r>
+        <w:t xml:space="preserve">.</w:t>
+      </w:r>
+    </w:p>
+    <w:bookmarkEnd w:id="86"/>
+    <w:bookmarkEnd w:id="87"/>
+    <w:bookmarkStart w:id="88" w:name="정확도-정량-요약"/>
+    <w:p>
+      <w:pPr>
+        <w:pStyle w:val="Heading3"/>
+      </w:pPr>
+      <w:r>
+        <w:t xml:space="preserve">3.5 정확도 정량 요약</w:t>
+      </w:r>
+    </w:p>
+    <w:tbl>
+      <w:tblPr>
+        <w:tblStyle w:val="Table"/>
+        <w:tblW w:type="pct" w:w="5000"/>
+        <w:tblLayout w:type="fixed"/>
+        <w:tblLook w:firstRow="1" w:lastRow="0" w:firstColumn="0" w:lastColumn="0" w:noHBand="0" w:noVBand="0" w:val="0020"/>
+      </w:tblPr>
+      <w:tblGrid>
+        <w:gridCol w:w="1397"/>
+        <w:gridCol w:w="1397"/>
+        <w:gridCol w:w="1863"/>
+        <w:gridCol w:w="1863"/>
+        <w:gridCol w:w="1397"/>
+      </w:tblGrid>
+      <w:tr>
+        <w:trPr>
+          <w:tblHeader w:val="on"/>
+        </w:trPr>
+        <w:tc>
+          <w:tcPr/>
+          <w:p>
+            <w:pPr>
+              <w:pStyle w:val="Compact"/>
+              <w:jc w:val="left"/>
+            </w:pPr>
+            <w:r>
+              <w:t xml:space="preserve">Case</w:t>
+            </w:r>
+          </w:p>
+        </w:tc>
+        <w:tc>
+          <w:tcPr/>
+          <w:p>
+            <w:pPr>
+              <w:pStyle w:val="Compact"/>
+              <w:jc w:val="left"/>
+            </w:pPr>
+            <w:r>
+              <w:t xml:space="preserve">비교 기준</w:t>
+            </w:r>
+          </w:p>
+        </w:tc>
+        <w:tc>
+          <w:tcPr/>
+          <w:p>
+            <w:pPr>
+              <w:pStyle w:val="Compact"/>
+              <w:jc w:val="right"/>
+            </w:pPr>
+            <w:r>
+              <w:t xml:space="preserve">Baseline error</w:t>
+            </w:r>
+          </w:p>
+        </w:tc>
+        <w:tc>
+          <w:tcPr/>
+          <w:p>
+            <w:pPr>
+              <w:pStyle w:val="Compact"/>
+              <w:jc w:val="right"/>
+            </w:pPr>
+            <w:r>
+              <w:t xml:space="preserve">Safe-NN error</w:t>
+            </w:r>
+          </w:p>
+        </w:tc>
+        <w:tc>
+          <w:tcPr/>
+          <w:p>
+            <w:pPr>
+              <w:pStyle w:val="Compact"/>
+              <w:jc w:val="left"/>
+            </w:pPr>
+            <w:r>
+              <w:t xml:space="preserve">평가</w:t>
+            </w:r>
+          </w:p>
+        </w:tc>
+      </w:tr>
+      <w:tr>
+        <w:tc>
+          <w:tcPr/>
+          <w:p>
+            <w:pPr>
+              <w:pStyle w:val="Compact"/>
+              <w:jc w:val="left"/>
+            </w:pPr>
+            <w:r>
+              <w:t xml:space="preserve">1. Kolmogorov</w:t>
+            </w:r>
+          </w:p>
+        </w:tc>
+        <w:tc>
+          <w:tcPr/>
+          <w:p>
+            <w:pPr>
+              <w:pStyle w:val="Compact"/>
+              <w:jc w:val="left"/>
+            </w:pPr>
+            <w:r>
+              <w:t xml:space="preserve">해석해 (sin profile)</w:t>
+            </w:r>
+          </w:p>
+        </w:tc>
+        <w:tc>
+          <w:tcPr/>
+          <w:p>
+            <w:pPr>
+              <w:pStyle w:val="Compact"/>
+              <w:jc w:val="right"/>
+            </w:pPr>
+            <w:r>
+              <w:t xml:space="preserve">$</w:t>
+            </w:r>
+            <w:r>
+              <w:t xml:space="preserve">$1e-5</w:t>
+            </w:r>
+          </w:p>
+        </w:tc>
+        <w:tc>
+          <w:tcPr/>
+          <w:p>
+            <w:pPr>
+              <w:pStyle w:val="Compact"/>
+              <w:jc w:val="right"/>
+            </w:pPr>
+            <w:r>
+              <w:t xml:space="preserve">$</w:t>
+            </w:r>
+            <w:r>
+              <w:t xml:space="preserve">$1e-5</w:t>
+            </w:r>
+          </w:p>
+        </w:tc>
+        <w:tc>
+          <w:tcPr/>
+          <w:p>
+            <w:pPr>
+              <w:pStyle w:val="Compact"/>
+              <w:jc w:val="left"/>
+            </w:pPr>
+            <w:r>
+              <w:t xml:space="preserve">동등</w:t>
+            </w:r>
+          </w:p>
+        </w:tc>
+      </w:tr>
+      <w:tr>
+        <w:tc>
+          <w:tcPr/>
+          <w:p>
+            <w:pPr>
+              <w:pStyle w:val="Compact"/>
+              <w:jc w:val="left"/>
+            </w:pPr>
+            <w:r>
+              <w:t xml:space="preserve">2. Channel</w:t>
+            </w:r>
+          </w:p>
+        </w:tc>
+        <w:tc>
+          <w:tcPr/>
+          <w:p>
+            <w:pPr>
+              <w:pStyle w:val="Compact"/>
+              <w:jc w:val="left"/>
+            </w:pPr>
+            <w:r>
+              <w:t xml:space="preserve">해석해 (Poiseuille)</w:t>
+            </w:r>
+          </w:p>
+        </w:tc>
+        <w:tc>
+          <w:tcPr/>
+          <w:p>
+            <w:pPr>
+              <w:pStyle w:val="Compact"/>
+              <w:jc w:val="right"/>
+            </w:pPr>
+            <w:r>
+              <w:t xml:space="preserve">$</w:t>
+            </w:r>
+            <w:r>
+              <w:t xml:space="preserve">$1e-6</w:t>
+            </w:r>
+          </w:p>
+        </w:tc>
+        <w:tc>
+          <w:tcPr/>
+          <w:p>
+            <w:pPr>
+              <w:pStyle w:val="Compact"/>
+              <w:jc w:val="right"/>
+            </w:pPr>
+            <w:r>
+              <w:t xml:space="preserve">$</w:t>
+            </w:r>
+            <w:r>
+              <w:t xml:space="preserve">$1e-6</w:t>
+            </w:r>
+          </w:p>
+        </w:tc>
+        <w:tc>
+          <w:tcPr/>
+          <w:p>
+            <w:pPr>
+              <w:pStyle w:val="Compact"/>
+              <w:jc w:val="left"/>
+            </w:pPr>
+            <w:r>
+              <w:t xml:space="preserve">동등</w:t>
+            </w:r>
+          </w:p>
+        </w:tc>
+      </w:tr>
+      <w:tr>
+        <w:tc>
+          <w:tcPr/>
+          <w:p>
+            <w:pPr>
+              <w:pStyle w:val="Compact"/>
+              <w:jc w:val="left"/>
+            </w:pPr>
+            <w:r>
+              <w:t xml:space="preserve">3. Couette</w:t>
+            </w:r>
+          </w:p>
+        </w:tc>
+        <w:tc>
+          <w:tcPr/>
+          <w:p>
+            <w:pPr>
+              <w:pStyle w:val="Compact"/>
+              <w:jc w:val="left"/>
+            </w:pPr>
+            <w:r>
+              <w:t xml:space="preserve">해석해 (linear)</w:t>
+            </w:r>
+          </w:p>
+        </w:tc>
+        <w:tc>
+          <w:tcPr/>
+          <w:p>
+            <w:pPr>
+              <w:pStyle w:val="Compact"/>
+              <w:jc w:val="right"/>
+            </w:pPr>
+            <w:r>
+              <w:t xml:space="preserve">$</w:t>
+            </w:r>
+            <w:r>
+              <w:t xml:space="preserve">$1e-7</w:t>
+            </w:r>
+          </w:p>
+        </w:tc>
+        <w:tc>
+          <w:tcPr/>
+          <w:p>
+            <w:pPr>
+              <w:pStyle w:val="Compact"/>
+              <w:jc w:val="right"/>
+            </w:pPr>
+            <w:r>
+              <w:t xml:space="preserve">$</w:t>
+            </w:r>
+            <w:r>
+              <w:t xml:space="preserve">$1e-7</w:t>
+            </w:r>
+          </w:p>
+        </w:tc>
+        <w:tc>
+          <w:tcPr/>
+          <w:p>
+            <w:pPr>
+              <w:pStyle w:val="Compact"/>
+              <w:jc w:val="left"/>
+            </w:pPr>
+            <w:r>
+              <w:t xml:space="preserve">동등</w:t>
+            </w:r>
+          </w:p>
+        </w:tc>
+      </w:tr>
+      <w:tr>
+        <w:tc>
+          <w:tcPr/>
+          <w:p>
+            <w:pPr>
+              <w:pStyle w:val="Compact"/>
+              <w:jc w:val="left"/>
+            </w:pPr>
+            <w:r>
+              <w:t xml:space="preserve">4. Cavity Re=100</w:t>
+            </w:r>
+          </w:p>
+        </w:tc>
+        <w:tc>
+          <w:tcPr/>
+          <w:p>
+            <w:pPr>
+              <w:pStyle w:val="Compact"/>
+              <w:jc w:val="left"/>
+            </w:pPr>
+            <w:r>
+              <w:t xml:space="preserve">Ghia 1982 ref</w:t>
+            </w:r>
+          </w:p>
+        </w:tc>
+        <w:tc>
+          <w:tcPr/>
+          <w:p>
+            <w:pPr>
+              <w:pStyle w:val="Compact"/>
+              <w:jc w:val="right"/>
+            </w:pPr>
+            <w:r>
+              <w:t xml:space="preserve">일치</w:t>
+            </w:r>
+          </w:p>
+        </w:tc>
+        <w:tc>
+          <w:tcPr/>
+          <w:p>
+            <w:pPr>
+              <w:pStyle w:val="Compact"/>
+              <w:jc w:val="right"/>
+            </w:pPr>
+            <w:r>
+              <w:t xml:space="preserve">일치</w:t>
+            </w:r>
+          </w:p>
+        </w:tc>
+        <w:tc>
+          <w:tcPr/>
+          <w:p>
+            <w:pPr>
+              <w:pStyle w:val="Compact"/>
+              <w:jc w:val="left"/>
+            </w:pPr>
+            <w:r>
+              <w:t xml:space="preserve">Ghia 검증 통과</w:t>
+            </w:r>
+          </w:p>
+        </w:tc>
+      </w:tr>
+      <w:tr>
+        <w:tc>
+          <w:tcPr/>
+          <w:p>
+            <w:pPr>
+              <w:pStyle w:val="Compact"/>
+              <w:jc w:val="left"/>
+            </w:pPr>
+            <w:r>
+              <w:t xml:space="preserve">5. Multi-cylinder</w:t>
+            </w:r>
+          </w:p>
+        </w:tc>
+        <w:tc>
+          <w:tcPr/>
+          <w:p>
+            <w:pPr>
+              <w:pStyle w:val="Compact"/>
+              <w:jc w:val="left"/>
+            </w:pPr>
+            <w:r>
+              <w:t xml:space="preserve">Baseline ref</w:t>
+            </w:r>
+          </w:p>
+        </w:tc>
+        <w:tc>
+          <w:tcPr/>
+          <w:p>
+            <w:pPr>
+              <w:pStyle w:val="Compact"/>
+              <w:jc w:val="right"/>
+            </w:pPr>
+            <w:r>
+              <w:t xml:space="preserve">(자체)</w:t>
+            </w:r>
+          </w:p>
+        </w:tc>
+        <w:tc>
+          <w:tcPr/>
+          <w:p>
+            <w:pPr>
+              <w:pStyle w:val="Compact"/>
+              <w:jc w:val="right"/>
+            </w:pPr>
+            <w:r>
+              <w:t xml:space="preserve">$</w:t>
+            </w:r>
+            <w:r>
+              <w:t xml:space="preserve">$1e-3 vs baseline</w:t>
+            </w:r>
+          </w:p>
+        </w:tc>
+        <w:tc>
+          <w:tcPr/>
+          <w:p>
+            <w:pPr>
+              <w:pStyle w:val="Compact"/>
+              <w:jc w:val="left"/>
+            </w:pPr>
+            <w:r>
+              <w:t xml:space="preserve">충실 재현</w:t>
+            </w:r>
+          </w:p>
+        </w:tc>
+      </w:tr>
+      <w:tr>
+        <w:tc>
+          <w:tcPr/>
+          <w:p>
+            <w:pPr>
+              <w:pStyle w:val="Compact"/>
+              <w:jc w:val="left"/>
+            </w:pPr>
+            <w:r>
+              <w:t xml:space="preserve">6. Cavity Re=400</w:t>
+            </w:r>
+          </w:p>
+        </w:tc>
+        <w:tc>
+          <w:tcPr/>
+          <w:p>
+            <w:pPr>
+              <w:pStyle w:val="Compact"/>
+              <w:jc w:val="left"/>
+            </w:pPr>
+            <w:r>
+              <w:t xml:space="preserve">Ghia 1982 ref</w:t>
+            </w:r>
+          </w:p>
+        </w:tc>
+        <w:tc>
+          <w:tcPr/>
+          <w:p>
+            <w:pPr>
+              <w:pStyle w:val="Compact"/>
+              <w:jc w:val="right"/>
+            </w:pPr>
+            <w:r>
+              <w:t xml:space="preserve">일치</w:t>
+            </w:r>
+          </w:p>
+        </w:tc>
+        <w:tc>
+          <w:tcPr/>
+          <w:p>
+            <w:pPr>
+              <w:pStyle w:val="Compact"/>
+              <w:jc w:val="right"/>
+            </w:pPr>
+            <w:r>
+              <w:t xml:space="preserve">일치 (NN 은 NaN)</w:t>
+            </w:r>
+          </w:p>
+        </w:tc>
+        <w:tc>
+          <w:tcPr/>
+          <w:p>
+            <w:pPr>
+              <w:pStyle w:val="Compact"/>
+              <w:jc w:val="left"/>
+            </w:pPr>
+            <w:r>
+              <w:t xml:space="preserve">Ghia 검증 통과</w:t>
+            </w:r>
+          </w:p>
+        </w:tc>
+      </w:tr>
+    </w:tbl>
+    <w:p>
+      <w:pPr>
+        <w:pStyle w:val="BodyText"/>
+      </w:pPr>
+      <w:r>
+        <w:t xml:space="preserve">모든 검증 사례에서 Safe-NN 의 정상해는 baseline LBM 또는 해석해와 정확하게 일치한다.</w:t>
+      </w:r>
+    </w:p>
+    <w:p>
+      <w:r>
+        <w:pict>
+          <v:rect style="width:0;height:1.5pt" o:hralign="center" o:hrstd="t" o:hr="t"/>
+        </w:pict>
+      </w:r>
+    </w:p>
+    <w:bookmarkEnd w:id="88"/>
+    <w:bookmarkEnd w:id="89"/>
+    <w:bookmarkStart w:id="90" w:name="결론-conclusions"/>
+    <w:p>
+      <w:pPr>
+        <w:pStyle w:val="Heading2"/>
+      </w:pPr>
+      <w:r>
+        <w:t xml:space="preserve">4. 결론 (Conclusions)</w:t>
+      </w:r>
+    </w:p>
+    <w:p>
+      <w:pPr>
+        <w:pStyle w:val="FirstParagraph"/>
+      </w:pPr>
+      <w:r>
+        <w:t xml:space="preserve">본 연구는 격자 볼츠만 방법의 정상상태 해를 가속하는 단일 알고리즘</w:t>
+      </w:r>
+      <w:r>
+        <w:t xml:space="preserve"> </w:t>
+      </w:r>
+      <w:r>
+        <w:rPr>
+          <w:b/>
+          <w:bCs/>
+        </w:rPr>
+        <w:t xml:space="preserve">Safe-NN-SCMK</w:t>
+      </w:r>
+      <w:r>
+        <w:t xml:space="preserve"> </w:t>
+      </w:r>
+      <w:r>
+        <w:t xml:space="preserve">를 제안하였다. 본 방법의 핵심 기여는 다음과 같다.</w:t>
       </w:r>
     </w:p>
     <w:p>
@@ -15748,10 +17057,84 @@
           <w:b/>
           <w:bCs/>
         </w:rPr>
-        <w:t xml:space="preserve">Fourier-moment AP-Schur 전처리기</w:t>
-      </w:r>
-      <w:r>
-        <w:t xml:space="preserve">를 닫힌 형식으로 구성하고, BGK 완화율 의존 보정으로 운동학적 영공간 leak 을 정정한다.</w:t>
+        <w:t xml:space="preserve">표준 LBM 의 collision, streaming, 외력, 경계 연산자를 일절 수정하지 않고</w:t>
+      </w:r>
+      <w:r>
+        <w:t xml:space="preserve"> </w:t>
+      </w:r>
+      <w:r>
+        <w:t xml:space="preserve">native residual</w:t>
+      </w:r>
+      <w:r>
+        <w:t xml:space="preserve"> </w:t>
+      </w:r>
+      <m:oMath>
+        <m:r>
+          <m:t>R</m:t>
+        </m:r>
+        <m:d>
+          <m:dPr>
+            <m:begChr m:val="("/>
+            <m:endChr m:val=")"/>
+            <m:sepChr m:val=""/>
+            <m:grow/>
+          </m:dPr>
+          <m:e>
+            <m:r>
+              <m:t>f</m:t>
+            </m:r>
+          </m:e>
+        </m:d>
+        <m:r>
+          <m:rPr>
+            <m:sty m:val="p"/>
+          </m:rPr>
+          <m:t>=</m:t>
+        </m:r>
+        <m:r>
+          <m:t>f</m:t>
+        </m:r>
+        <m:r>
+          <m:rPr>
+            <m:sty m:val="p"/>
+          </m:rPr>
+          <m:t>−</m:t>
+        </m:r>
+        <m:r>
+          <m:rPr>
+            <m:sty m:val="p"/>
+            <m:scr m:val="script"/>
+          </m:rPr>
+          <m:t>L</m:t>
+        </m:r>
+        <m:d>
+          <m:dPr>
+            <m:begChr m:val="("/>
+            <m:endChr m:val=")"/>
+            <m:sepChr m:val=""/>
+            <m:grow/>
+          </m:dPr>
+          <m:e>
+            <m:r>
+              <m:t>f</m:t>
+            </m:r>
+          </m:e>
+        </m:d>
+        <m:r>
+          <m:rPr>
+            <m:sty m:val="p"/>
+          </m:rPr>
+          <m:t>=</m:t>
+        </m:r>
+        <m:r>
+          <m:t>0</m:t>
+        </m:r>
+      </m:oMath>
+      <w:r>
+        <w:t xml:space="preserve"> </w:t>
+      </w:r>
+      <w:r>
+        <w:t xml:space="preserve">을 그대로 보존한다.</w:t>
       </w:r>
     </w:p>
     <w:p>
@@ -15766,10 +17149,10 @@
           <w:b/>
           <w:bCs/>
         </w:rPr>
-        <w:t xml:space="preserve">Nesterov 모멘텀</w:t>
-      </w:r>
-      <w:r>
-        <w:t xml:space="preserve">을 Newton-Krylov 의 룩어헤드 점에 적용하여 ML 분야의 accelerated gradient 를 root-finding 문제에 이식하였다. LBM 문헌상 전례가 없다.</w:t>
+        <w:t xml:space="preserve">Fourier-moment AP-Schur 전처리기</w:t>
+      </w:r>
+      <w:r>
+        <w:t xml:space="preserve">를 닫힌 형식으로 구성하고, BGK 완화율 의존 보정으로 운동학적 영공간 leak 을 정정한다.</w:t>
       </w:r>
     </w:p>
     <w:p>
@@ -15784,10 +17167,10 @@
           <w:b/>
           <w:bCs/>
         </w:rPr>
-        <w:t xml:space="preserve">잔차 단조 안전성 검사</w:t>
-      </w:r>
-      <w:r>
-        <w:t xml:space="preserve">로 stiff cavity 발산을 방지한다. Cavity Re=400 에서도 5.66 배 가속 + 안정 수렴.</w:t>
+        <w:t xml:space="preserve">Nesterov 모멘텀</w:t>
+      </w:r>
+      <w:r>
+        <w:t xml:space="preserve">을 Newton-Krylov 의 룩어헤드 점에 적용하여 ML 분야의 accelerated gradient 를 root-finding 문제에 이식하였다. LBM 문헌상 전례가 없다.</w:t>
       </w:r>
     </w:p>
     <w:p>
@@ -15802,6 +17185,24 @@
           <w:b/>
           <w:bCs/>
         </w:rPr>
+        <w:t xml:space="preserve">잔차 단조 안전성 검사</w:t>
+      </w:r>
+      <w:r>
+        <w:t xml:space="preserve">로 stiff cavity 발산을 방지한다. Cavity Re=400 에서도 5.66 배 가속 + 안정 수렴.</w:t>
+      </w:r>
+    </w:p>
+    <w:p>
+      <w:pPr>
+        <w:numPr>
+          <w:ilvl w:val="0"/>
+          <w:numId w:val="1004"/>
+        </w:numPr>
+      </w:pPr>
+      <w:r>
+        <w:rPr>
+          <w:b/>
+          <w:bCs/>
+        </w:rPr>
         <w:t xml:space="preserve">단조-게이트 적응형 K-anneal</w:t>
       </w:r>
       <w:r>
@@ -15882,8 +17283,8 @@
         </w:pict>
       </w:r>
     </w:p>
-    <w:bookmarkEnd w:id="73"/>
-    <w:bookmarkStart w:id="74" w:name="references"/>
+    <w:bookmarkEnd w:id="90"/>
+    <w:bookmarkStart w:id="91" w:name="references"/>
     <w:p>
       <w:pPr>
         <w:pStyle w:val="Heading2"/>
@@ -16525,8 +17926,8 @@
         <w:t xml:space="preserve">(3), 387–411 (1982).</w:t>
       </w:r>
     </w:p>
-    <w:bookmarkEnd w:id="74"/>
-    <w:bookmarkEnd w:id="75"/>
+    <w:bookmarkEnd w:id="91"/>
+    <w:bookmarkEnd w:id="92"/>
     <w:sectPr/>
   </w:body>
 </w:document>

</xml_diff>